<commit_message>
Add highlight settings and improve VT handling
Rename UI to Phish-Hussar Mk3 and add configurable settings for warning message size, highlighted word colour, and URL highlight colour in the extension popup. Persist and load these settings in HTML_Controler.js (save/load values, UI label updates, event listeners) and add defensive checks and try/catch around the WHOIS API probe. Improve VirusTotal flow: BackGround_WORKER.js now validates inputs, returns errors when responses lack analysis IDs, and forwards clearer error objects; check_url.js handles VirusTotal errors, exits early if no API key, and retries with better logging. Make highlight_words.js inject CSS asynchronously using stored settings (font-size and colours) and ensure updated CSS is reapplied. Update manifest host_permissions for localhost/LAN to http and tweak style.css for header and settings styling.
</commit_message>
<xml_diff>
--- a/COMP 3000/Project Docs/Main doc v2.docx
+++ b/COMP 3000/Project Docs/Main doc v2.docx
@@ -1068,6 +1068,14 @@
     </w:sdt>
     <w:sdt>
       <w:sdtPr>
+        <w:rPr>
+          <w:rFonts w:asciiTheme="minorHAnsi" w:eastAsiaTheme="minorEastAsia" w:hAnsiTheme="minorHAnsi" w:cstheme="minorBidi"/>
+          <w:b w:val="0"/>
+          <w:color w:val="auto"/>
+          <w:sz w:val="22"/>
+          <w:szCs w:val="22"/>
+          <w:u w:val="none"/>
+        </w:rPr>
         <w:id w:val="-842317033"/>
         <w:docPartObj>
           <w:docPartGallery w:val="Table of Contents"/>
@@ -1076,12 +1084,7 @@
       </w:sdtPr>
       <w:sdtEndPr>
         <w:rPr>
-          <w:rFonts w:asciiTheme="minorHAnsi" w:eastAsiaTheme="minorEastAsia" w:hAnsiTheme="minorHAnsi" w:cstheme="minorBidi"/>
           <w:bCs/>
-          <w:color w:val="auto"/>
-          <w:sz w:val="22"/>
-          <w:szCs w:val="22"/>
-          <w:u w:val="none"/>
         </w:rPr>
       </w:sdtEndPr>
       <w:sdtContent>
@@ -11588,14 +11591,7 @@
                 <w:sz w:val="22"/>
                 <w:szCs w:val="22"/>
               </w:rPr>
-              <w:t xml:space="preserve">Develop </w:t>
-            </w:r>
-            <w:r>
-              <w:rPr>
-                <w:sz w:val="22"/>
-                <w:szCs w:val="22"/>
-              </w:rPr>
-              <w:t>Software that can be easily maintained and updated to adapt to changes.</w:t>
+              <w:t>Develop Software that can be easily maintained and updated to adapt to changes.</w:t>
             </w:r>
           </w:p>
         </w:tc>
@@ -11662,14 +11658,7 @@
                 <w:sz w:val="22"/>
                 <w:szCs w:val="22"/>
               </w:rPr>
-              <w:t>Have all data processed locally where it is possible. If cloud services used or off device processing, use encrypted transmission and have a clear privacy policy</w:t>
-            </w:r>
-            <w:r>
-              <w:rPr>
-                <w:sz w:val="22"/>
-                <w:szCs w:val="22"/>
-              </w:rPr>
-              <w:t xml:space="preserve"> and allow user to decide if to use.</w:t>
+              <w:t>Have all data processed locally where it is possible. If cloud services used or off device processing, use encrypted transmission and have a clear privacy policy and allow user to decide if to use.</w:t>
             </w:r>
           </w:p>
         </w:tc>
@@ -11947,14 +11936,7 @@
                 <w:sz w:val="22"/>
                 <w:szCs w:val="22"/>
               </w:rPr>
-              <w:t>If a free and opensource API fails or stops working. Paid alternatives may be used incurring additional costs of the project and may result in an unaccounted cost for users</w:t>
-            </w:r>
-            <w:r>
-              <w:rPr>
-                <w:sz w:val="22"/>
-                <w:szCs w:val="22"/>
-              </w:rPr>
-              <w:t>. Alternatively disable that API may reduce the effectiveness of data.</w:t>
+              <w:t>If a free and opensource API fails or stops working. Paid alternatives may be used incurring additional costs of the project and may result in an unaccounted cost for users. Alternatively disable that API may reduce the effectiveness of data.</w:t>
             </w:r>
           </w:p>
         </w:tc>
@@ -13637,6 +13619,9 @@
     </w:p>
     <w:p>
       <w:r>
+        <w:rPr>
+          <w:noProof/>
+        </w:rPr>
         <w:drawing>
           <wp:inline distT="0" distB="0" distL="0" distR="0" wp14:anchorId="5B247EB6" wp14:editId="6E15F661">
             <wp:extent cx="5731510" cy="3277235"/>
@@ -14037,10 +14022,215 @@
         <w:t xml:space="preserve"> Better handling of errors.</w:t>
       </w:r>
     </w:p>
+    <w:p/>
     <w:p>
       <w:pPr>
         <w:pStyle w:val="Heading2"/>
       </w:pPr>
+      <w:r>
+        <w:t>Prototype v4</w:t>
+      </w:r>
+    </w:p>
+    <w:p>
+      <w:pPr>
+        <w:pStyle w:val="Heading3"/>
+      </w:pPr>
+      <w:r>
+        <w:t>Images</w:t>
+      </w:r>
+    </w:p>
+    <w:p>
+      <w:r>
+        <w:drawing>
+          <wp:inline distT="0" distB="0" distL="0" distR="0" wp14:anchorId="206B3AC7" wp14:editId="62D2CF46">
+            <wp:extent cx="5731510" cy="2315210"/>
+            <wp:effectExtent l="0" t="0" r="2540" b="8890"/>
+            <wp:docPr id="757123938" name="Picture 1"/>
+            <wp:cNvGraphicFramePr>
+              <a:graphicFrameLocks xmlns:a="http://schemas.openxmlformats.org/drawingml/2006/main" noChangeAspect="1"/>
+            </wp:cNvGraphicFramePr>
+            <a:graphic xmlns:a="http://schemas.openxmlformats.org/drawingml/2006/main">
+              <a:graphicData uri="http://schemas.openxmlformats.org/drawingml/2006/picture">
+                <pic:pic xmlns:pic="http://schemas.openxmlformats.org/drawingml/2006/picture">
+                  <pic:nvPicPr>
+                    <pic:cNvPr id="757123938" name=""/>
+                    <pic:cNvPicPr/>
+                  </pic:nvPicPr>
+                  <pic:blipFill>
+                    <a:blip r:embed="rId30"/>
+                    <a:stretch>
+                      <a:fillRect/>
+                    </a:stretch>
+                  </pic:blipFill>
+                  <pic:spPr>
+                    <a:xfrm>
+                      <a:off x="0" y="0"/>
+                      <a:ext cx="5731510" cy="2315210"/>
+                    </a:xfrm>
+                    <a:prstGeom prst="rect">
+                      <a:avLst/>
+                    </a:prstGeom>
+                  </pic:spPr>
+                </pic:pic>
+              </a:graphicData>
+            </a:graphic>
+          </wp:inline>
+        </w:drawing>
+      </w:r>
+    </w:p>
+    <w:p>
+      <w:r>
+        <w:lastRenderedPageBreak/>
+        <w:drawing>
+          <wp:inline distT="0" distB="0" distL="0" distR="0" wp14:anchorId="21FBEEDE" wp14:editId="59078307">
+            <wp:extent cx="2438740" cy="3105583"/>
+            <wp:effectExtent l="0" t="0" r="0" b="0"/>
+            <wp:docPr id="666104856" name="Picture 1"/>
+            <wp:cNvGraphicFramePr>
+              <a:graphicFrameLocks xmlns:a="http://schemas.openxmlformats.org/drawingml/2006/main" noChangeAspect="1"/>
+            </wp:cNvGraphicFramePr>
+            <a:graphic xmlns:a="http://schemas.openxmlformats.org/drawingml/2006/main">
+              <a:graphicData uri="http://schemas.openxmlformats.org/drawingml/2006/picture">
+                <pic:pic xmlns:pic="http://schemas.openxmlformats.org/drawingml/2006/picture">
+                  <pic:nvPicPr>
+                    <pic:cNvPr id="666104856" name=""/>
+                    <pic:cNvPicPr/>
+                  </pic:nvPicPr>
+                  <pic:blipFill>
+                    <a:blip r:embed="rId31"/>
+                    <a:stretch>
+                      <a:fillRect/>
+                    </a:stretch>
+                  </pic:blipFill>
+                  <pic:spPr>
+                    <a:xfrm>
+                      <a:off x="0" y="0"/>
+                      <a:ext cx="2438740" cy="3105583"/>
+                    </a:xfrm>
+                    <a:prstGeom prst="rect">
+                      <a:avLst/>
+                    </a:prstGeom>
+                  </pic:spPr>
+                </pic:pic>
+              </a:graphicData>
+            </a:graphic>
+          </wp:inline>
+        </w:drawing>
+      </w:r>
+      <w:r>
+        <w:drawing>
+          <wp:inline distT="0" distB="0" distL="0" distR="0" wp14:anchorId="180DF318" wp14:editId="6A33966A">
+            <wp:extent cx="2314898" cy="3048425"/>
+            <wp:effectExtent l="0" t="0" r="9525" b="0"/>
+            <wp:docPr id="191972819" name="Picture 1"/>
+            <wp:cNvGraphicFramePr>
+              <a:graphicFrameLocks xmlns:a="http://schemas.openxmlformats.org/drawingml/2006/main" noChangeAspect="1"/>
+            </wp:cNvGraphicFramePr>
+            <a:graphic xmlns:a="http://schemas.openxmlformats.org/drawingml/2006/main">
+              <a:graphicData uri="http://schemas.openxmlformats.org/drawingml/2006/picture">
+                <pic:pic xmlns:pic="http://schemas.openxmlformats.org/drawingml/2006/picture">
+                  <pic:nvPicPr>
+                    <pic:cNvPr id="191972819" name=""/>
+                    <pic:cNvPicPr/>
+                  </pic:nvPicPr>
+                  <pic:blipFill>
+                    <a:blip r:embed="rId32"/>
+                    <a:stretch>
+                      <a:fillRect/>
+                    </a:stretch>
+                  </pic:blipFill>
+                  <pic:spPr>
+                    <a:xfrm>
+                      <a:off x="0" y="0"/>
+                      <a:ext cx="2314898" cy="3048425"/>
+                    </a:xfrm>
+                    <a:prstGeom prst="rect">
+                      <a:avLst/>
+                    </a:prstGeom>
+                  </pic:spPr>
+                </pic:pic>
+              </a:graphicData>
+            </a:graphic>
+          </wp:inline>
+        </w:drawing>
+      </w:r>
+      <w:r>
+        <w:drawing>
+          <wp:inline distT="0" distB="0" distL="0" distR="0" wp14:anchorId="73159EEB" wp14:editId="1F7EA3B8">
+            <wp:extent cx="2257740" cy="3077004"/>
+            <wp:effectExtent l="0" t="0" r="9525" b="9525"/>
+            <wp:docPr id="1444194078" name="Picture 1"/>
+            <wp:cNvGraphicFramePr>
+              <a:graphicFrameLocks xmlns:a="http://schemas.openxmlformats.org/drawingml/2006/main" noChangeAspect="1"/>
+            </wp:cNvGraphicFramePr>
+            <a:graphic xmlns:a="http://schemas.openxmlformats.org/drawingml/2006/main">
+              <a:graphicData uri="http://schemas.openxmlformats.org/drawingml/2006/picture">
+                <pic:pic xmlns:pic="http://schemas.openxmlformats.org/drawingml/2006/picture">
+                  <pic:nvPicPr>
+                    <pic:cNvPr id="1444194078" name=""/>
+                    <pic:cNvPicPr/>
+                  </pic:nvPicPr>
+                  <pic:blipFill>
+                    <a:blip r:embed="rId33"/>
+                    <a:stretch>
+                      <a:fillRect/>
+                    </a:stretch>
+                  </pic:blipFill>
+                  <pic:spPr>
+                    <a:xfrm>
+                      <a:off x="0" y="0"/>
+                      <a:ext cx="2257740" cy="3077004"/>
+                    </a:xfrm>
+                    <a:prstGeom prst="rect">
+                      <a:avLst/>
+                    </a:prstGeom>
+                  </pic:spPr>
+                </pic:pic>
+              </a:graphicData>
+            </a:graphic>
+          </wp:inline>
+        </w:drawing>
+      </w:r>
+    </w:p>
+    <w:p/>
+    <w:p>
+      <w:pPr>
+        <w:pStyle w:val="Heading3"/>
+      </w:pPr>
+      <w:r>
+        <w:t>Changes</w:t>
+      </w:r>
+    </w:p>
+    <w:p>
+      <w:pPr>
+        <w:pStyle w:val="Heading4"/>
+      </w:pPr>
+      <w:r>
+        <w:t>UI</w:t>
+      </w:r>
+    </w:p>
+    <w:p>
+      <w:r>
+        <w:t>Users now can change the size of the warning text and the colour of the warning text. This can be anything they would like for it to be.</w:t>
+      </w:r>
+    </w:p>
+    <w:p>
+      <w:pPr>
+        <w:pStyle w:val="Heading5"/>
+      </w:pPr>
+      <w:r>
+        <w:t>Issues</w:t>
+      </w:r>
+    </w:p>
+    <w:p>
+      <w:r>
+        <w:t>Users may change the colour to something that makes the text not readable. They can change it to something that works.</w:t>
+      </w:r>
+    </w:p>
+    <w:p>
+      <w:pPr>
+        <w:pStyle w:val="Heading2"/>
+      </w:pPr>
       <w:bookmarkStart w:id="53" w:name="_Toc225105889"/>
       <w:r>
         <w:t>Phishing Link</w:t>
@@ -14061,7 +14251,7 @@
       <w:bookmarkEnd w:id="54"/>
     </w:p>
     <w:p>
-      <w:hyperlink r:id="rId30" w:history="1">
+      <w:hyperlink r:id="rId34" w:history="1">
         <w:r>
           <w:rPr>
             <w:rStyle w:val="Hyperlink"/>
@@ -14072,6 +14262,7 @@
     </w:p>
     <w:p>
       <w:r>
+        <w:lastRenderedPageBreak/>
         <w:t>This GitHub repository contains real phishing emails that have been collected via a honeypot email address and users submitted emails. Contains real malware and links to scam websites.</w:t>
       </w:r>
     </w:p>
@@ -14103,7 +14294,7 @@
       <w:r>
         <w:br/>
       </w:r>
-      <w:hyperlink r:id="rId31" w:history="1">
+      <w:hyperlink r:id="rId35" w:history="1">
         <w:r>
           <w:rPr>
             <w:rStyle w:val="Hyperlink"/>
@@ -14175,7 +14366,7 @@
                     <pic:cNvPicPr/>
                   </pic:nvPicPr>
                   <pic:blipFill>
-                    <a:blip r:embed="rId32"/>
+                    <a:blip r:embed="rId36"/>
                     <a:stretch>
                       <a:fillRect/>
                     </a:stretch>
@@ -14213,7 +14404,6 @@
         <w:rPr>
           <w:noProof/>
         </w:rPr>
-        <w:lastRenderedPageBreak/>
         <w:drawing>
           <wp:inline distT="0" distB="0" distL="0" distR="0" wp14:anchorId="016CBC84" wp14:editId="4388C315">
             <wp:extent cx="5731510" cy="2137410"/>
@@ -14230,7 +14420,7 @@
                     <pic:cNvPicPr/>
                   </pic:nvPicPr>
                   <pic:blipFill>
-                    <a:blip r:embed="rId33"/>
+                    <a:blip r:embed="rId37"/>
                     <a:stretch>
                       <a:fillRect/>
                     </a:stretch>
@@ -14278,7 +14468,7 @@
       </w:r>
     </w:p>
     <w:p>
-      <w:hyperlink r:id="rId34" w:history="1">
+      <w:hyperlink r:id="rId38" w:history="1">
         <w:r>
           <w:rPr>
             <w:rStyle w:val="Hyperlink"/>
@@ -14390,7 +14580,7 @@
         <w:br/>
         <w:t xml:space="preserve">Original : </w:t>
       </w:r>
-      <w:hyperlink r:id="rId35" w:history="1">
+      <w:hyperlink r:id="rId39" w:history="1">
         <w:r>
           <w:rPr>
             <w:rStyle w:val="Hyperlink"/>
@@ -14402,7 +14592,7 @@
         <w:br/>
         <w:t xml:space="preserve">Shorten 1 (1 redirect) : </w:t>
       </w:r>
-      <w:hyperlink r:id="rId36" w:history="1">
+      <w:hyperlink r:id="rId40" w:history="1">
         <w:r>
           <w:rPr>
             <w:rStyle w:val="Hyperlink"/>
@@ -16479,7 +16669,7 @@
       <w:r>
         <w:t xml:space="preserve">. Available at: </w:t>
       </w:r>
-      <w:hyperlink r:id="rId37" w:history="1">
+      <w:hyperlink r:id="rId41" w:history="1">
         <w:r>
           <w:rPr>
             <w:rStyle w:val="Hyperlink"/>
@@ -16547,7 +16737,7 @@
       <w:r>
         <w:t xml:space="preserve">. [online] www.ncsc.gov.uk. Available at: </w:t>
       </w:r>
-      <w:hyperlink r:id="rId38" w:history="1">
+      <w:hyperlink r:id="rId42" w:history="1">
         <w:r>
           <w:rPr>
             <w:rStyle w:val="Hyperlink"/>
@@ -16573,7 +16763,7 @@
       <w:r>
         <w:t xml:space="preserve"> (2026). Available at: </w:t>
       </w:r>
-      <w:hyperlink r:id="rId39" w:history="1">
+      <w:hyperlink r:id="rId43" w:history="1">
         <w:r>
           <w:rPr>
             <w:rStyle w:val="Hyperlink"/>
@@ -16625,7 +16815,7 @@
       <w:r>
         <w:t xml:space="preserve">. Available at: </w:t>
       </w:r>
-      <w:hyperlink r:id="rId40" w:history="1">
+      <w:hyperlink r:id="rId44" w:history="1">
         <w:r>
           <w:rPr>
             <w:rStyle w:val="Hyperlink"/>
@@ -16690,7 +16880,7 @@
       <w:r>
         <w:t xml:space="preserve">. Available at: </w:t>
       </w:r>
-      <w:hyperlink r:id="rId41" w:history="1">
+      <w:hyperlink r:id="rId45" w:history="1">
         <w:r>
           <w:rPr>
             <w:rStyle w:val="Hyperlink"/>
@@ -16730,7 +16920,7 @@
       <w:r>
         <w:t xml:space="preserve">. Available at: </w:t>
       </w:r>
-      <w:hyperlink r:id="rId42" w:history="1">
+      <w:hyperlink r:id="rId46" w:history="1">
         <w:r>
           <w:rPr>
             <w:rStyle w:val="Hyperlink"/>
@@ -16772,7 +16962,7 @@
       <w:r>
         <w:t xml:space="preserve">, 11(1). Available at: </w:t>
       </w:r>
-      <w:hyperlink r:id="rId43" w:history="1">
+      <w:hyperlink r:id="rId47" w:history="1">
         <w:r>
           <w:rPr>
             <w:rStyle w:val="Hyperlink"/>
@@ -16819,7 +17009,7 @@
       <w:r>
         <w:t xml:space="preserve">. Available at: </w:t>
       </w:r>
-      <w:hyperlink r:id="rId44" w:history="1">
+      <w:hyperlink r:id="rId48" w:history="1">
         <w:r>
           <w:rPr>
             <w:rStyle w:val="Hyperlink"/>
@@ -17024,7 +17214,7 @@
                     <pic:cNvPicPr/>
                   </pic:nvPicPr>
                   <pic:blipFill>
-                    <a:blip r:embed="rId45"/>
+                    <a:blip r:embed="rId49"/>
                     <a:stretch>
                       <a:fillRect/>
                     </a:stretch>
@@ -17064,7 +17254,7 @@
                     <pic:cNvPicPr/>
                   </pic:nvPicPr>
                   <pic:blipFill>
-                    <a:blip r:embed="rId46"/>
+                    <a:blip r:embed="rId50"/>
                     <a:stretch>
                       <a:fillRect/>
                     </a:stretch>
@@ -17086,7 +17276,7 @@
       </w:r>
     </w:p>
     <w:sectPr>
-      <w:footerReference w:type="default" r:id="rId47"/>
+      <w:footerReference w:type="default" r:id="rId51"/>
       <w:pgSz w:w="11906" w:h="16838"/>
       <w:pgMar w:top="1440" w:right="1440" w:bottom="1440" w:left="1440" w:header="708" w:footer="708" w:gutter="0"/>
       <w:pgNumType w:start="0"/>
@@ -19997,6 +20187,7 @@
   <w:style w:type="character" w:default="1" w:styleId="DefaultParagraphFont">
     <w:name w:val="Default Paragraph Font"/>
     <w:uiPriority w:val="1"/>
+    <w:semiHidden/>
     <w:unhideWhenUsed/>
   </w:style>
   <w:style w:type="table" w:default="1" w:styleId="TableNormal">

</xml_diff>